<commit_message>
Fix techspec and add report
</commit_message>
<xml_diff>
--- a/plk/vein/tz.docx
+++ b/plk/vein/tz.docx
@@ -1,6 +1,6 @@
 
 <file path=word/document.xml><?xml version="1.0" encoding="utf-8"?>
-<w:document xmlns:wpc="http://schemas.microsoft.com/office/word/2010/wordprocessingCanvas" xmlns:cx="http://schemas.microsoft.com/office/drawing/2014/chartex" xmlns:cx1="http://schemas.microsoft.com/office/drawing/2015/9/8/chartex" xmlns:cx2="http://schemas.microsoft.com/office/drawing/2015/10/21/chartex" xmlns:cx3="http://schemas.microsoft.com/office/drawing/2016/5/9/chartex" xmlns:cx4="http://schemas.microsoft.com/office/drawing/2016/5/10/chartex" xmlns:cx5="http://schemas.microsoft.com/office/drawing/2016/5/11/chartex" xmlns:cx6="http://schemas.microsoft.com/office/drawing/2016/5/12/chartex" xmlns:cx7="http://schemas.microsoft.com/office/drawing/2016/5/13/chartex" xmlns:cx8="http://schemas.microsoft.com/office/drawing/2016/5/14/chartex" xmlns:mc="http://schemas.openxmlformats.org/markup-compatibility/2006" xmlns:aink="http://schemas.microsoft.com/office/drawing/2016/ink" xmlns:am3d="http://schemas.microsoft.com/office/drawing/2017/model3d" xmlns:o="urn:schemas-microsoft-com:office:office" xmlns:oel="http://schemas.microsoft.com/office/2019/extlst" xmlns:r="http://schemas.openxmlformats.org/officeDocument/2006/relationships" xmlns:m="http://schemas.openxmlformats.org/officeDocument/2006/math" xmlns:v="urn:schemas-microsoft-com:vml" xmlns:wp14="http://schemas.microsoft.com/office/word/2010/wordprocessingDrawing" xmlns:wp="http://schemas.openxmlformats.org/drawingml/2006/wordprocessingDrawing" xmlns:w10="urn:schemas-microsoft-com:office:word" xmlns:w="http://schemas.openxmlformats.org/wordprocessingml/2006/main" xmlns:w14="http://schemas.microsoft.com/office/word/2010/wordml" xmlns:w15="http://schemas.microsoft.com/office/word/2012/wordml" xmlns:w16cex="http://schemas.microsoft.com/office/word/2018/wordml/cex" xmlns:w16cid="http://schemas.microsoft.com/office/word/2016/wordml/cid" xmlns:w16="http://schemas.microsoft.com/office/word/2018/wordml" xmlns:w16sdtdh="http://schemas.microsoft.com/office/word/2020/wordml/sdtdatahash" xmlns:w16se="http://schemas.microsoft.com/office/word/2015/wordml/symex" xmlns:wpg="http://schemas.microsoft.com/office/word/2010/wordprocessingGroup" xmlns:wpi="http://schemas.microsoft.com/office/word/2010/wordprocessingInk" xmlns:wne="http://schemas.microsoft.com/office/word/2006/wordml" xmlns:wps="http://schemas.microsoft.com/office/word/2010/wordprocessingShape" mc:Ignorable="w14 w15 w16se w16cid w16 w16cex w16sdtdh wp14">
+<w:document xmlns:wpc="http://schemas.microsoft.com/office/word/2010/wordprocessingCanvas" xmlns:cx="http://schemas.microsoft.com/office/drawing/2014/chartex" xmlns:cx1="http://schemas.microsoft.com/office/drawing/2015/9/8/chartex" xmlns:cx2="http://schemas.microsoft.com/office/drawing/2015/10/21/chartex" xmlns:cx3="http://schemas.microsoft.com/office/drawing/2016/5/9/chartex" xmlns:cx4="http://schemas.microsoft.com/office/drawing/2016/5/10/chartex" xmlns:cx5="http://schemas.microsoft.com/office/drawing/2016/5/11/chartex" xmlns:cx6="http://schemas.microsoft.com/office/drawing/2016/5/12/chartex" xmlns:cx7="http://schemas.microsoft.com/office/drawing/2016/5/13/chartex" xmlns:cx8="http://schemas.microsoft.com/office/drawing/2016/5/14/chartex" xmlns:mc="http://schemas.openxmlformats.org/markup-compatibility/2006" xmlns:aink="http://schemas.microsoft.com/office/drawing/2016/ink" xmlns:am3d="http://schemas.microsoft.com/office/drawing/2017/model3d" xmlns:o="urn:schemas-microsoft-com:office:office" xmlns:oel="http://schemas.microsoft.com/office/2019/extlst" xmlns:r="http://schemas.openxmlformats.org/officeDocument/2006/relationships" xmlns:m="http://schemas.openxmlformats.org/officeDocument/2006/math" xmlns:v="urn:schemas-microsoft-com:vml" xmlns:wp14="http://schemas.microsoft.com/office/word/2010/wordprocessingDrawing" xmlns:wp="http://schemas.openxmlformats.org/drawingml/2006/wordprocessingDrawing" xmlns:w10="urn:schemas-microsoft-com:office:word" xmlns:w="http://schemas.openxmlformats.org/wordprocessingml/2006/main" xmlns:w14="http://schemas.microsoft.com/office/word/2010/wordml" xmlns:w15="http://schemas.microsoft.com/office/word/2012/wordml" xmlns:w16cex="http://schemas.microsoft.com/office/word/2018/wordml/cex" xmlns:w16cid="http://schemas.microsoft.com/office/word/2016/wordml/cid" xmlns:w16="http://schemas.microsoft.com/office/word/2018/wordml" xmlns:w16du="http://schemas.microsoft.com/office/word/2023/wordml/word16du" xmlns:w16sdtdh="http://schemas.microsoft.com/office/word/2020/wordml/sdtdatahash" xmlns:w16se="http://schemas.microsoft.com/office/word/2015/wordml/symex" xmlns:wpg="http://schemas.microsoft.com/office/word/2010/wordprocessingGroup" xmlns:wpi="http://schemas.microsoft.com/office/word/2010/wordprocessingInk" xmlns:wne="http://schemas.microsoft.com/office/word/2006/wordml" xmlns:wps="http://schemas.microsoft.com/office/word/2010/wordprocessingShape" mc:Ignorable="w14 w15 w16se w16cid w16 w16cex w16sdtdh wp14">
   <w:body>
     <w:p>
       <w:pPr>
@@ -182,9 +182,6 @@
         <w:pStyle w:val="a3"/>
         <w:ind w:left="0" w:firstLine="851"/>
       </w:pPr>
-      <w:r>
-        <w:t>Когда</w:t>
-      </w:r>
     </w:p>
     <w:p>
       <w:pPr>
@@ -217,7 +214,13 @@
         <w:t xml:space="preserve">на входе конвейера </w:t>
       </w:r>
       <w:r>
-        <w:t>достигает значения 100.</w:t>
+        <w:t>достигает значения </w:t>
+      </w:r>
+      <w:r>
+        <w:t>2</w:t>
+      </w:r>
+      <w:r>
+        <w:t>0.</w:t>
       </w:r>
     </w:p>
     <w:p>
@@ -268,19 +271,32 @@
       <w:r>
         <w:t>Сброс счетчика</w:t>
       </w:r>
-      <w:proofErr w:type="gramStart"/>
       <w:r>
         <w:t xml:space="preserve">: </w:t>
       </w:r>
       <w:r>
         <w:t>Если</w:t>
       </w:r>
-      <w:proofErr w:type="gramEnd"/>
-      <w:r>
-        <w:t xml:space="preserve"> оба датчика насчитали 20 единиц продукции, счетчик </w:t>
-      </w:r>
-      <w:r>
-        <w:t>должен быть сброшен в 0 для начала нового цикла подсчета.</w:t>
+      <w:r>
+        <w:t xml:space="preserve"> оба датчика насчитали 20 единиц продукции, счетчик</w:t>
+      </w:r>
+      <w:r>
+        <w:t>и</w:t>
+      </w:r>
+      <w:r>
+        <w:t xml:space="preserve"> </w:t>
+      </w:r>
+      <w:r>
+        <w:t>сбр</w:t>
+      </w:r>
+      <w:r>
+        <w:t>асываются</w:t>
+      </w:r>
+      <w:r>
+        <w:t xml:space="preserve"> в 0 для начала нового цикла подсчета</w:t>
+      </w:r>
+      <w:r>
+        <w:t>, а также автоматически убирается шибер и запускается конвейер</w:t>
       </w:r>
     </w:p>
     <w:p>
@@ -308,21 +324,6 @@
         <w:ind w:left="0" w:firstLine="851"/>
       </w:pPr>
       <w:r>
-        <w:t>Инициализация: В системе ведется счетчик </w:t>
-      </w:r>
-      <w:r>
-        <w:t>от датчика, установленного на выходе конвейера</w:t>
-      </w:r>
-      <w:r>
-        <w:t>.</w:t>
-      </w:r>
-    </w:p>
-    <w:p>
-      <w:pPr>
-        <w:pStyle w:val="a3"/>
-        <w:ind w:left="0" w:firstLine="851"/>
-      </w:pPr>
-      <w:r>
         <w:t>Условие аварии: Одновременное выполнение следующих условий:</w:t>
       </w:r>
     </w:p>
@@ -407,18 +408,19 @@
         <w:ind w:left="0" w:firstLine="851"/>
       </w:pPr>
       <w:r>
-        <w:t>На операторскую панель выводится сообщение: "ВНИМАНИЕ</w:t>
-      </w:r>
-      <w:proofErr w:type="gramStart"/>
-      <w:r>
-        <w:t xml:space="preserve">: </w:t>
-      </w:r>
-      <w:r>
-        <w:t>На</w:t>
-      </w:r>
-      <w:proofErr w:type="gramEnd"/>
-      <w:r>
-        <w:t xml:space="preserve"> конвейере пропала продукция.»</w:t>
+        <w:t xml:space="preserve">На операторскую панель выводится сообщение: "ВНИМАНИЕ: </w:t>
+      </w:r>
+      <w:r>
+        <w:t>На конвейере пропала продукция.»</w:t>
+      </w:r>
+    </w:p>
+    <w:p>
+      <w:pPr>
+        <w:pStyle w:val="a3"/>
+        <w:ind w:left="0" w:firstLine="851"/>
+      </w:pPr>
+      <w:r>
+        <w:t>При этом конвейер выключается, а шибер все еще стоит.</w:t>
       </w:r>
     </w:p>
     <w:p>
@@ -437,6 +439,15 @@
       </w:r>
       <w:r>
         <w:t>» на операторской панели.</w:t>
+      </w:r>
+    </w:p>
+    <w:p>
+      <w:pPr>
+        <w:pStyle w:val="a3"/>
+        <w:ind w:left="851"/>
+      </w:pPr>
+      <w:r>
+        <w:t>По нажатию кнопки на операторской панели шибер поднимается, а также запускается конвейер. Значение счетчиков также обнуляются.</w:t>
       </w:r>
     </w:p>
     <w:p>
@@ -457,7 +468,7 @@
 </file>
 
 <file path=word/numbering.xml><?xml version="1.0" encoding="utf-8"?>
-<w:numbering xmlns:wpc="http://schemas.microsoft.com/office/word/2010/wordprocessingCanvas" xmlns:cx="http://schemas.microsoft.com/office/drawing/2014/chartex" xmlns:cx1="http://schemas.microsoft.com/office/drawing/2015/9/8/chartex" xmlns:cx2="http://schemas.microsoft.com/office/drawing/2015/10/21/chartex" xmlns:cx3="http://schemas.microsoft.com/office/drawing/2016/5/9/chartex" xmlns:cx4="http://schemas.microsoft.com/office/drawing/2016/5/10/chartex" xmlns:cx5="http://schemas.microsoft.com/office/drawing/2016/5/11/chartex" xmlns:cx6="http://schemas.microsoft.com/office/drawing/2016/5/12/chartex" xmlns:cx7="http://schemas.microsoft.com/office/drawing/2016/5/13/chartex" xmlns:cx8="http://schemas.microsoft.com/office/drawing/2016/5/14/chartex" xmlns:mc="http://schemas.openxmlformats.org/markup-compatibility/2006" xmlns:aink="http://schemas.microsoft.com/office/drawing/2016/ink" xmlns:am3d="http://schemas.microsoft.com/office/drawing/2017/model3d" xmlns:o="urn:schemas-microsoft-com:office:office" xmlns:oel="http://schemas.microsoft.com/office/2019/extlst" xmlns:r="http://schemas.openxmlformats.org/officeDocument/2006/relationships" xmlns:m="http://schemas.openxmlformats.org/officeDocument/2006/math" xmlns:v="urn:schemas-microsoft-com:vml" xmlns:wp14="http://schemas.microsoft.com/office/word/2010/wordprocessingDrawing" xmlns:wp="http://schemas.openxmlformats.org/drawingml/2006/wordprocessingDrawing" xmlns:w10="urn:schemas-microsoft-com:office:word" xmlns:w="http://schemas.openxmlformats.org/wordprocessingml/2006/main" xmlns:w14="http://schemas.microsoft.com/office/word/2010/wordml" xmlns:w15="http://schemas.microsoft.com/office/word/2012/wordml" xmlns:w16cex="http://schemas.microsoft.com/office/word/2018/wordml/cex" xmlns:w16cid="http://schemas.microsoft.com/office/word/2016/wordml/cid" xmlns:w16="http://schemas.microsoft.com/office/word/2018/wordml" xmlns:w16sdtdh="http://schemas.microsoft.com/office/word/2020/wordml/sdtdatahash" xmlns:w16se="http://schemas.microsoft.com/office/word/2015/wordml/symex" xmlns:wpg="http://schemas.microsoft.com/office/word/2010/wordprocessingGroup" xmlns:wpi="http://schemas.microsoft.com/office/word/2010/wordprocessingInk" xmlns:wne="http://schemas.microsoft.com/office/word/2006/wordml" xmlns:wps="http://schemas.microsoft.com/office/word/2010/wordprocessingShape" mc:Ignorable="w14 w15 w16se w16cid w16 w16cex w16sdtdh wp14">
+<w:numbering xmlns:wpc="http://schemas.microsoft.com/office/word/2010/wordprocessingCanvas" xmlns:cx="http://schemas.microsoft.com/office/drawing/2014/chartex" xmlns:cx1="http://schemas.microsoft.com/office/drawing/2015/9/8/chartex" xmlns:cx2="http://schemas.microsoft.com/office/drawing/2015/10/21/chartex" xmlns:cx3="http://schemas.microsoft.com/office/drawing/2016/5/9/chartex" xmlns:cx4="http://schemas.microsoft.com/office/drawing/2016/5/10/chartex" xmlns:cx5="http://schemas.microsoft.com/office/drawing/2016/5/11/chartex" xmlns:cx6="http://schemas.microsoft.com/office/drawing/2016/5/12/chartex" xmlns:cx7="http://schemas.microsoft.com/office/drawing/2016/5/13/chartex" xmlns:cx8="http://schemas.microsoft.com/office/drawing/2016/5/14/chartex" xmlns:mc="http://schemas.openxmlformats.org/markup-compatibility/2006" xmlns:aink="http://schemas.microsoft.com/office/drawing/2016/ink" xmlns:am3d="http://schemas.microsoft.com/office/drawing/2017/model3d" xmlns:o="urn:schemas-microsoft-com:office:office" xmlns:oel="http://schemas.microsoft.com/office/2019/extlst" xmlns:r="http://schemas.openxmlformats.org/officeDocument/2006/relationships" xmlns:m="http://schemas.openxmlformats.org/officeDocument/2006/math" xmlns:v="urn:schemas-microsoft-com:vml" xmlns:wp14="http://schemas.microsoft.com/office/word/2010/wordprocessingDrawing" xmlns:wp="http://schemas.openxmlformats.org/drawingml/2006/wordprocessingDrawing" xmlns:w10="urn:schemas-microsoft-com:office:word" xmlns:w="http://schemas.openxmlformats.org/wordprocessingml/2006/main" xmlns:w14="http://schemas.microsoft.com/office/word/2010/wordml" xmlns:w15="http://schemas.microsoft.com/office/word/2012/wordml" xmlns:w16cex="http://schemas.microsoft.com/office/word/2018/wordml/cex" xmlns:w16cid="http://schemas.microsoft.com/office/word/2016/wordml/cid" xmlns:w16="http://schemas.microsoft.com/office/word/2018/wordml" xmlns:w16du="http://schemas.microsoft.com/office/word/2023/wordml/word16du" xmlns:w16sdtdh="http://schemas.microsoft.com/office/word/2020/wordml/sdtdatahash" xmlns:w16se="http://schemas.microsoft.com/office/word/2015/wordml/symex" xmlns:wpg="http://schemas.microsoft.com/office/word/2010/wordprocessingGroup" xmlns:wpi="http://schemas.microsoft.com/office/word/2010/wordprocessingInk" xmlns:wne="http://schemas.microsoft.com/office/word/2006/wordml" xmlns:wps="http://schemas.microsoft.com/office/word/2010/wordprocessingShape" mc:Ignorable="w14 w15 w16se w16cid w16 w16cex w16sdtdh wp14">
   <w:abstractNum w:abstractNumId="0" w15:restartNumberingAfterBreak="0">
     <w:nsid w:val="18E001BD"/>
     <w:multiLevelType w:val="hybridMultilevel"/>
@@ -1520,23 +1531,7 @@
   </w:num>
   <w:num w:numId="6" w16cid:durableId="1193835277">
     <w:abstractNumId w:val="6"/>
-    <w:lvlOverride w:ilvl="1">
-      <w:lvl w:ilvl="1">
-        <w:numFmt w:val="bullet"/>
-        <w:lvlText w:val="o"/>
-        <w:lvlJc w:val="left"/>
-        <w:pPr>
-          <w:tabs>
-            <w:tab w:val="num" w:pos="1440"/>
-          </w:tabs>
-          <w:ind w:left="1440" w:hanging="360"/>
-        </w:pPr>
-        <w:rPr>
-          <w:rFonts w:ascii="Courier New" w:hAnsi="Courier New" w:hint="default"/>
-          <w:sz w:val="20"/>
-        </w:rPr>
-      </w:lvl>
-    </w:lvlOverride>
+    <w:lvlOverride w:ilvl="0"/>
   </w:num>
   <w:num w:numId="7" w16cid:durableId="992218729">
     <w:abstractNumId w:val="5"/>

</xml_diff>